<commit_message>
feat: Add Vercel deployment support and platform-specific TLP generation
- Add Vercel serverless configuration (vercel.json, requirements.txt)
- Create storage abstraction layer for cloud storage (Supabase/S3)
- Add API endpoint for user API key management
- Implement on-demand pipeline step execution
- Add Daily Insights download functionality (ZIP and single file)
- Add TLP platform selection modal with topic filtering
- Update pipeline routes to support platform/topic parameters
- Add CSS and JavaScript for new UI components
- Update .env.example with all configuration options
- Add VERCEL_DEPLOYMENT.md guide

Key features:
- Users can now select specific social media platforms for TLP generation
- Daily Insights can be downloaded individually or as a ZIP archive
- API keys can be managed through the dashboard
- Pipeline steps can be run independently
- Full Vercel deployment support with cloud storage backend
</commit_message>
<xml_diff>
--- a/Daily_Tech_Briefing.docx
+++ b/Daily_Tech_Briefing.docx
@@ -16,7 +16,7 @@
         <w:rPr>
           <w:i/>
         </w:rPr>
-        <w:t>May 20, 2026</w:t>
+        <w:t>May 28, 2026</w:t>
       </w:r>
     </w:p>
     <w:p/>
@@ -33,7 +33,7 @@
         <w:pStyle w:val="Heading2"/>
       </w:pPr>
       <w:r>
-        <w:t>May 20, 2026</w:t>
+        <w:t>May 28, 2026</w:t>
       </w:r>
     </w:p>
     <w:p>
@@ -46,7 +46,7 @@
     </w:p>
     <w:p>
       <w:r>
-        <w:t>Google's AI Agents: Driving Next-Gen Interaction</w:t>
+        <w:t>Ethical AI and Agentic Platforms Drive Industry Focus</w:t>
       </w:r>
     </w:p>
     <w:p>
@@ -54,7 +54,7 @@
         <w:pStyle w:val="Heading2"/>
       </w:pPr>
       <w:r>
-        <w:t>AI Industry Briefing: May 20, 2026</w:t>
+        <w:t>AI Industry Briefing: May 28, 2026</w:t>
       </w:r>
     </w:p>
     <w:p>
@@ -67,17 +67,17 @@
     </w:p>
     <w:p>
       <w:r>
-        <w:t>- **Conversational AI:** Google is implementing conversational AI search capabilities for YouTube videos and enabling users to interact directly with their Gmail inboxes. [1] [2]</w:t>
+        <w:t>- **AI Advertising:** Google is integrating its Display Ads into an AI-first Demand Gen platform aimed at enhancing campaign creation and optimization [2].</w:t>
       </w:r>
     </w:p>
     <w:p>
       <w:r>
-        <w:t>- **Agent Focus:** Google's AI development strategy is reportedly pivoting towards sophisticated AI agents, such as Gemini 3.5 Flash, which are designed to perform complex, multi-step tasks rather than simple chatbot interactions. [3]</w:t>
+        <w:t>- **Agentic AI Foundations:** Merck and Mastercard are reportedly achieving tangible results with agentic AI, emphasizing the necessity of foundational infrastructure [5].</w:t>
       </w:r>
     </w:p>
     <w:p>
       <w:r>
-        <w:t>- **Real-World Integration:** Gemini is being integrated into practical applications, including interpreting external camera data from vehicles like Volvo to understand environmental cues such as parking signs. [5]</w:t>
+        <w:t>- **Ethical AI Concerns:** Pope Francis has raised concerns about AI's potential to undermine human dignity and advocates for robust human oversight in its development [1].</w:t>
       </w:r>
     </w:p>
     <w:p>
@@ -87,32 +87,32 @@
     </w:p>
     <w:p>
       <w:r>
-        <w:t>Expanding Conversational AI</w:t>
+        <w:t>Google's AI-First Ad Platform</w:t>
       </w:r>
     </w:p>
     <w:p>
       <w:r>
-        <w:t>Google is actively enhancing user interaction across its core services by introducing new conversational AI features. YouTube is set to offer an AI-powered conversational search, allowing users to query video content directly. Additionally, the Gemini Omni feature will be integrated into YouTube Shorts. Simultaneously, Gmail users will gain the ability to interact with their inboxes using conversational AI, facilitating communication and management of emails. [1] [2]</w:t>
+        <w:t>Google is reportedly integrating its Display Ads into a new AI-first Demand Gen platform [2]. This strategic initiative is designed to leverage artificial intelligence for more efficient campaign creation and optimization, signaling a broader industry shift towards AI-centric advertising solutions [2]. The unified platform is intended to streamline the advertising process and improve performance through advanced AI capabilities [2].</w:t>
       </w:r>
     </w:p>
     <w:p>
       <w:r>
-        <w:t>The Emergence of AI Agents</w:t>
+        <w:t>Implementing Agentic AI</w:t>
       </w:r>
     </w:p>
     <w:p>
       <w:r>
-        <w:t>A significant shift in Google's AI strategy emphasizes the development of AI agents over traditional chatbots. The introduction of Gemini 3.5 Flash exemplifies this direction, focusing on AI systems capable of executing multi-step operations autonomously. This move indicates a commitment to AI that can understand context and perform more intricate tasks, moving beyond single-turn responses typical of earlier conversational AI models. [3]</w:t>
+        <w:t>Both Merck and Mastercard are observing measurable outcomes from the application of agentic artificial intelligence within their operations [5]. These companies emphasize that the successful deployment of agentic AI was contingent upon establishing robust foundational infrastructure, often referred to as "the plumbing," prior to implementation [5]. This suggests that significant preparatory work on core systems is essential for effective agentic AI integration and results [5].</w:t>
       </w:r>
     </w:p>
     <w:p>
       <w:r>
-        <w:t>Data, Trust, and Real-World AI</w:t>
+        <w:t>Advanced Models and Ethical Dialogue</w:t>
       </w:r>
     </w:p>
     <w:p>
       <w:r>
-        <w:t>The progression of Google's AI initiatives, particularly with advanced agents, necessitates the collection and utilization of user data. This dependency underscores the critical importance of earning and maintaining user trust for the successful deployment and adoption of these technologies. In practical applications, Gemini is demonstrating its ability to interpret real-world data; for instance, it can process visual information from Volvo’s external cameras to identify and understand parking signs. [4] [5]</w:t>
+        <w:t>MiniMax has announced upcoming advancements with its M3 model, which will allegedly feature a novel sparse attention mechanism [4]. This innovation is reported to deliver a 15.6-fold increase in long-context response speed [4]. Concurrently, Pope Francis has expressed significant reservations regarding the trajectory of artificial intelligence development [1]. He has highlighted concerns about AI's capacity to undermine human dignity and potentially foster a "technological dictatorship" [1]. The Pope advocates for strong human oversight and ethical frameworks in AI's evolution, maintaining that AI cannot replicate human consciousness or achieve general artificial intelligence [1].</w:t>
       </w:r>
     </w:p>
     <w:p>
@@ -125,7 +125,7 @@
         <w:pStyle w:val="ListNumber"/>
       </w:pPr>
       <w:r>
-        <w:t>1. What strategic adjustments should AI executives consider given Google's clear pivot from chatbots to AI agents?</w:t>
+        <w:t>1. How will the increasing integration of AI into advertising platforms redefine competition and innovation in digital marketing?</w:t>
       </w:r>
     </w:p>
     <w:p>
@@ -133,7 +133,7 @@
         <w:pStyle w:val="ListNumber"/>
       </w:pPr>
       <w:r>
-        <w:t>2. How might the integration of conversational AI into platforms like YouTube and Gmail alter established user interaction patterns and expectations?</w:t>
+        <w:t>2. What specific foundational "plumbing" investments are most critical for organizations planning to implement agentic AI solutions successfully?</w:t>
       </w:r>
     </w:p>
     <w:p>
@@ -141,7 +141,7 @@
         <w:pStyle w:val="ListNumber"/>
       </w:pPr>
       <w:r>
-        <w:t>3. What new challenges and opportunities for data privacy and security emerge as AI agents become more deeply embedded in personal and real-world applications?</w:t>
+        <w:t>3. How can businesses proactively address ethical concerns and ensure human oversight in the development and deployment of advanced AI models like MiniMax's M3?</w:t>
       </w:r>
     </w:p>
     <w:p>
@@ -149,7 +149,7 @@
         <w:pStyle w:val="ListNumber"/>
       </w:pPr>
       <w:r>
-        <w:t>4. How can businesses ensure trust and transparency with users as AI systems increasingly rely on personal data for advanced functionalities?</w:t>
+        <w:t>4. What are the broader societal implications of AI advancements on human dignity and autonomy, as highlighted by public figures like Pope Francis?</w:t>
       </w:r>
     </w:p>
     <w:p>
@@ -157,7 +157,7 @@
         <w:pStyle w:val="ListNumber"/>
       </w:pPr>
       <w:r>
-        <w:t>5. What are the broader implications for autonomous systems and edge AI computing with the expansion of AI agents interpreting real-world environmental data?</w:t>
+        <w:t>5. How can AI executives balance the pursuit of speed and efficiency in new AI models with the need for robust ethical guidelines and transparency?</w:t>
       </w:r>
     </w:p>
     <w:p>
@@ -170,27 +170,27 @@
     </w:p>
     <w:p>
       <w:r>
-        <w:t>[1] ‘Ask YouTube’ brings AI-powered conversational search to video, adds Gemini Omni to Shorts - May 20, 2026</w:t>
+        <w:t>[1] The Pope isn’t AGI-pilled - May 27, 2026</w:t>
       </w:r>
     </w:p>
     <w:p>
       <w:r>
-        <w:t>[2] You can now talk to your Gmail inbox, as seen at Google IO 2026 - May 19, 2026</w:t>
+        <w:t>[2] Google folds Display Ads into AI-first Demand Gen platform - May 27, 2026</w:t>
       </w:r>
     </w:p>
     <w:p>
       <w:r>
-        <w:t>[3] With Gemini 3.5 Flash, Google bets its next AI wave on agents, not chatbots - May 19, 2026</w:t>
+        <w:t>[3] The Download: keeping up with AI, and the future of IVF - May 27, 2026</w:t>
       </w:r>
     </w:p>
     <w:p>
       <w:r>
-        <w:t>[4] Google’s AI future demands trust — and your personal data - May 19, 2026</w:t>
+        <w:t>[4] MiniMax teases upcoming M3 model with new sparse attention mechanism and 15.6X long-context response speed boost - May 27, 2026</w:t>
       </w:r>
     </w:p>
     <w:p>
       <w:r>
-        <w:t>[5] Gemini will use Volvo’s external cameras to interpret parking signs - May 19, 2026</w:t>
+        <w:t>[5] Merck and Mastercard are seeing real agentic AI results. Both say the plumbing came first. - May 27, 2026</w:t>
       </w:r>
     </w:p>
     <w:p>
@@ -203,7 +203,7 @@
     </w:p>
     <w:p>
       <w:r>
-        <w:t>Urgent Windows Vulnerabilities and Cybercrime Interdiction</w:t>
+        <w:t>Critical Vulnerabilities Demand Immediate Executive Action</w:t>
       </w:r>
     </w:p>
     <w:p>
@@ -211,7 +211,7 @@
         <w:pStyle w:val="Heading2"/>
       </w:pPr>
       <w:r>
-        <w:t>Cyber Security Briefing: May 20, 2026</w:t>
+        <w:t>Cyber Security Briefing: May 28, 2026</w:t>
       </w:r>
     </w:p>
     <w:p>
@@ -224,17 +224,17 @@
     </w:p>
     <w:p>
       <w:r>
-        <w:t>- **Zero-Day Mitigation:** Microsoft has issued mitigations for a new Windows zero-day vulnerability, YellowKey CVE-2026-45585, which bypasses BitLocker [1, 2].</w:t>
+        <w:t>- **Supply Chain Risks:** A malicious npm package has been observed stealing files from Claude AI user directories via GitHub [1].</w:t>
       </w:r>
     </w:p>
     <w:p>
       <w:r>
-        <w:t>- **Cybercrime Disruption:** A service that enabled the signing of malware through a Microsoft platform has been disrupted [3].</w:t>
+        <w:t>- **Platform Exposure:** A newly identified Gitea vulnerability exposes private container images to unauthorized access without authentication [2].</w:t>
       </w:r>
     </w:p>
     <w:p>
       <w:r>
-        <w:t>- **Vulnerability Overload:** Enterprises continue to face a high volume of vulnerabilities, as highlighted in the latest Verizon DBIR report [4].</w:t>
+        <w:t>- **Federal Mandate:** CISA has issued an urgent directive for federal agencies to patch an actively exploited cPanel plugin flaw within four days [3].</w:t>
       </w:r>
     </w:p>
     <w:p>
@@ -244,32 +244,32 @@
     </w:p>
     <w:p>
       <w:r>
-        <w:t>YellowKey BitLocker Bypass Mitigation</w:t>
+        <w:t>Malicious Software in Development Supply Chains</w:t>
       </w:r>
     </w:p>
     <w:p>
       <w:r>
-        <w:t>Microsoft has released guidance and mitigation steps for a recently discovered Windows zero-day vulnerability, identified as CVE-2026-45585 and codenamed YellowKey [1, 2]. This vulnerability reportedly allows for a bypass of BitLocker protection [1]. The release of these mitigations follows a period marked by a series of unpatched Windows zero-day vulnerabilities, some of which emerged after recent Patch Tuesday updates [5]. Organizations are strongly advised to implement the recommended mitigation measures promptly to safeguard against potential exploitation [1, 2].</w:t>
+        <w:t>A malicious npm package was reportedly utilized to exfiltrate files from the Claude AI user directory, with the activity traced through GitHub [1]. This incident highlights ongoing risks within software development supply chains, where seemingly legitimate components can be compromised to target end-user data [1]. Organizations relying on open-source dependencies are particularly susceptible to such supply chain attacks.</w:t>
       </w:r>
     </w:p>
     <w:p>
       <w:r>
-        <w:t>Cybercrime Service Interdiction</w:t>
+        <w:t>Gitea Repository Vulnerability</w:t>
       </w:r>
     </w:p>
     <w:p>
       <w:r>
-        <w:t>Law enforcement and security partners have successfully disrupted a cybercrime service that facilitated the signing of malicious software [3]. This service was reportedly abusing a Microsoft platform to lend legitimacy to malware, which could then more easily evade traditional security defenses [3]. The disruption of this operation is expected to hinder malicious actors' capabilities to distribute signed malware effectively [3].</w:t>
+        <w:t>A critical vulnerability has been identified in Gitea, a self-hosted Git service, which could expose private container images [2]. This flaw allows unauthorized access to sensitive container images without requiring any authentication, posing a significant data breach risk for organizations utilizing Gitea for repository management [2]. Immediate assessment and remediation are crucial for installations of the affected software.</w:t>
       </w:r>
     </w:p>
     <w:p>
       <w:r>
-        <w:t>Enterprise Vulnerability Landscape</w:t>
+        <w:t>Urgent Federal Patching Directive for cPanel</w:t>
       </w:r>
     </w:p>
     <w:p>
       <w:r>
-        <w:t>The Verizon Data Breach Investigations Report (DBIR) indicates that enterprises are contending with a significant challenge: a pervasive "vulnerability glut" [4]. This finding suggests that organizations are facing an overwhelming number of security weaknesses that require attention [4]. The report underscores the ongoing necessity for robust and proactive vulnerability management strategies to navigate this complex threat landscape [4].</w:t>
+        <w:t>The Cybersecurity and Infrastructure Security Agency (CISA) has mandated that federal agencies address an actively exploited cPanel plugin vulnerability within a four-day timeframe [3]. The urgency of this directive underscores the severe risk posed by this particular flaw, which has been observed in active exploitation campaigns targeting governmental entities [3]. This indicates that the vulnerability is a known vector for adversaries and requires prompt attention across all sectors.</w:t>
       </w:r>
     </w:p>
     <w:p>
@@ -282,7 +282,7 @@
         <w:pStyle w:val="ListNumber"/>
       </w:pPr>
       <w:r>
-        <w:t>1. What immediate actions are required to implement the YellowKey BitLocker bypass mitigations within our infrastructure?</w:t>
+        <w:t>1. How does our organization's software supply chain security strategy mitigate risks from malicious packages like the npm incident reported?</w:t>
       </w:r>
     </w:p>
     <w:p>
@@ -290,7 +290,7 @@
         <w:pStyle w:val="ListNumber"/>
       </w:pPr>
       <w:r>
-        <w:t>2. How can our organization enhance its threat intelligence capabilities to anticipate and defend against emerging zero-day vulnerabilities more effectively?</w:t>
+        <w:t>2. What internal audit processes are in place to identify and address vulnerabilities in self-hosted services, such as the Gitea exposure of private container images?</w:t>
       </w:r>
     </w:p>
     <w:p>
@@ -298,7 +298,7 @@
         <w:pStyle w:val="ListNumber"/>
       </w:pPr>
       <w:r>
-        <w:t>3. What revisions to our software supply chain security and application control policies are necessary following the disruption of the malware signing service?</w:t>
+        <w:t>3. What is our current posture regarding CISA directives, and how quickly can our teams respond to similar urgent patching mandates for critical infrastructure components?</w:t>
       </w:r>
     </w:p>
     <w:p>
@@ -306,7 +306,7 @@
         <w:pStyle w:val="ListNumber"/>
       </w:pPr>
       <w:r>
-        <w:t>4. In light of the "vulnerability glut" reported by Verizon, how are we prioritizing and addressing the most critical vulnerabilities across our enterprise environment?</w:t>
+        <w:t>4. How is our organization leveraging emerging cybersecurity technologies, such as AI-native security, to move beyond traditional perimeter defense strategies?</w:t>
       </w:r>
     </w:p>
     <w:p>
@@ -314,7 +314,7 @@
         <w:pStyle w:val="ListNumber"/>
       </w:pPr>
       <w:r>
-        <w:t>5. What strategic adjustments should be considered for our incident response plans to account for rapid-fire zero-day discoveries and widespread cybercrime disruptions?</w:t>
+        <w:t>5. What steps are we taking to ensure rapid intelligence dissemination and incident response for actively exploited vulnerabilities impacting widely used platforms?</w:t>
       </w:r>
     </w:p>
     <w:p>
@@ -327,27 +327,22 @@
     </w:p>
     <w:p>
       <w:r>
-        <w:t>[1] Microsoft Releases Mitigation for YellowKey BitLocker Bypass CVE-2026-45585 Exploit - May 20, 2026</w:t>
+        <w:t>[1] Malicious npm Package Stole Files From Claude AI User Directory via GitHub - May 27, 2026</w:t>
       </w:r>
     </w:p>
     <w:p>
       <w:r>
-        <w:t>[2] Microsoft shares mitigation for YellowKey Windows zero-day - May 20, 2026</w:t>
+        <w:t>[2] Gitea Vulnerability Exposes Private Container Images without Authentication - May 27, 2026</w:t>
       </w:r>
     </w:p>
     <w:p>
       <w:r>
-        <w:t>[3] Cybercrime service disrupted for abusing Microsoft platform to sign malware - May 19, 2026</w:t>
+        <w:t>[3] CISA gives feds 4 days to patch actively exploited cPanel plugin flaw - May 27, 2026</w:t>
       </w:r>
     </w:p>
     <w:p>
       <w:r>
-        <w:t>[4] Verizon DBIR: Enterprises Face a Dangerous Vulnerability Glut - May 19, 2026</w:t>
-      </w:r>
-    </w:p>
-    <w:p>
-      <w:r>
-        <w:t>[5] Windows Zero-Day Barrage Continues After Patch Tuesday - May 19, 2026</w:t>
+        <w:t>[4] Cybersecurity Evolution: How We Went From Perimeter Defense to AI-Native Security - May 27, 2026</w:t>
       </w:r>
     </w:p>
     <w:p>
@@ -360,7 +355,7 @@
     </w:p>
     <w:p>
       <w:r>
-        <w:t>Geopolitical Shifts Impact Crypto Market Rebound</w:t>
+        <w:t>Blockchain Market Dynamics: Key Legislative and Investment Trends</w:t>
       </w:r>
     </w:p>
     <w:p>
@@ -368,7 +363,7 @@
         <w:pStyle w:val="Heading2"/>
       </w:pPr>
       <w:r>
-        <w:t>Crypto, Fintech, and Web3 Briefing: May 20, 2026</w:t>
+        <w:t>Crypto, Fintech, and Web3 Briefing: May 28, 2026</w:t>
       </w:r>
     </w:p>
     <w:p>
@@ -381,17 +376,17 @@
     </w:p>
     <w:p>
       <w:r>
-        <w:t>- **Market Recovery:** Major cryptocurrencies including Bitcoin, Ether, and XRP saw a rebound following news that the U.S. Senate moved to limit presidential war powers regarding Iran [1].</w:t>
+        <w:t>- **Bitcoin Valuation:** The GENIUS Act has influenced a re-evaluation of Bitcoin's monetary premium, altering its perception as a value store [1].</w:t>
       </w:r>
     </w:p>
     <w:p>
       <w:r>
-        <w:t>- **Bear Market Outlook:** Analysis suggests the current Bitcoin bear market features exceptionally pessimistic traders, which could potentially constrain further market declines [2].</w:t>
+        <w:t>- **IPO Market:** Jefferies forecasts a potential $1 trillion market for crypto IPOs, driven by the ongoing trend of asset tokenization [2].</w:t>
       </w:r>
     </w:p>
     <w:p>
       <w:r>
-        <w:t>- **Asset Opportunity:** Bitwise has identified Hyperliquid’s HYPE as one of the crypto market’s most undervalued assets [3].</w:t>
+        <w:t>- **Senate Legislation:** A bipartisan effort in the Senate is called upon to complete the legislative framework for digital assets [3].</w:t>
       </w:r>
     </w:p>
     <w:p>
@@ -401,32 +396,32 @@
     </w:p>
     <w:p>
       <w:r>
-        <w:t>Cryptocurrency Market Rebound and Geopolitical Factors</w:t>
+        <w:t>Bitcoin's Monetary Premium and Legislation</w:t>
       </w:r>
     </w:p>
     <w:p>
       <w:r>
-        <w:t>Bitcoin, Ether, and XRP experienced a recovery in their valuations. This market movement coincided with reports that the U.S. Senate had initiated steps to curb presidential authority concerning military actions in Iran. The legislative action, which pertains to potential military engagement, appears to have influenced investor sentiment in the cryptocurrency market, contributing to the asset rebound [1].</w:t>
+        <w:t>The GENIUS Act has significantly impacted how Bitcoin's monetary premium is understood and valued, leading to a repricing within the market [1]. This legislative development is identified as a key factor in reshaping the economic perception of Bitcoin as a foundational store of wealth [1].</w:t>
       </w:r>
     </w:p>
     <w:p>
       <w:r>
-        <w:t>Bitcoin Bear Market Characteristics</w:t>
+        <w:t>Crypto IPOs and Tokenization Potential</w:t>
       </w:r>
     </w:p>
     <w:p>
       <w:r>
-        <w:t>The current Bitcoin bear market is noted for distinct characteristics compared to previous cycles. Analysis by K33 Research indicates that traders exhibit a "uniquely pessimistic" outlook. This elevated level of negativity among market participants is suggested to act as a limiting factor on the potential for further significant downside price movements [2].</w:t>
+        <w:t>Analysts at Jefferies project that the crypto sector could generate a substantial $1 trillion market from Initial Public Offerings [2]. This projected expansion is primarily attributed to the accelerating adoption of asset tokenization, which is expected to open new avenues for capital formation in the digital economy [2].</w:t>
       </w:r>
     </w:p>
     <w:p>
       <w:r>
-        <w:t>Hyperliquid's HYPE Asset Valuation</w:t>
+        <w:t>Digital Asset Regulatory Framework</w:t>
       </w:r>
     </w:p>
     <w:p>
       <w:r>
-        <w:t>The asset HYPE, associated with the Hyperliquid platform, has been highlighted by Bitwise as a potentially undervalued asset within the cryptocurrency ecosystem. This assessment positions HYPE as a notable consideration for investors seeking opportunities in the current market [3].</w:t>
+        <w:t>There is a pressing call for the Senate to finalize comprehensive legislation pertaining to digital assets [3]. Proponents emphasize the importance of a bipartisan approach to establish a stable and forward-looking regulatory environment, ensuring clarity and growth for the evolving digital asset landscape [3].</w:t>
       </w:r>
     </w:p>
     <w:p>
@@ -439,7 +434,7 @@
         <w:pStyle w:val="ListNumber"/>
       </w:pPr>
       <w:r>
-        <w:t>1. How might legislative actions and geopolitical shifts continue to influence cryptocurrency market volatility and investor confidence?</w:t>
+        <w:t>1. How might the recent repricing of Bitcoin's monetary premium following the GENIUS Act influence long-term institutional investment strategies?</w:t>
       </w:r>
     </w:p>
     <w:p>
@@ -447,7 +442,7 @@
         <w:pStyle w:val="ListNumber"/>
       </w:pPr>
       <w:r>
-        <w:t>2. What internal metrics and risk management strategies can blockchain executives implement to prepare for and capitalize on "uniquely pessimistic" market environments?</w:t>
+        <w:t>2. What strategic opportunities and challenges does the projected $1 trillion crypto IPO market, driven by tokenization, present for traditional financial institutions considering digital asset integration?</w:t>
       </w:r>
     </w:p>
     <w:p>
@@ -455,7 +450,7 @@
         <w:pStyle w:val="ListNumber"/>
       </w:pPr>
       <w:r>
-        <w:t>3. How should blockchain firms evaluate and integrate analyst recommendations regarding undervalued assets like HYPE into their strategic planning and investment portfolios?</w:t>
+        <w:t>3. How can blockchain executives best prepare for and engage with the ongoing bipartisan legislative efforts in the Senate to shape a stable regulatory environment for digital assets?</w:t>
       </w:r>
     </w:p>
     <w:p>
@@ -463,7 +458,7 @@
         <w:pStyle w:val="ListNumber"/>
       </w:pPr>
       <w:r>
-        <w:t>4. What role do on-chain analytics play in confirming or contradicting sentiment-based market analyses from traditional research firms?</w:t>
+        <w:t>4. What role will enhanced token disclosure standards, championed by major exchanges, play in attracting and retaining institutional capital within the blockchain ecosystem?</w:t>
       </w:r>
     </w:p>
     <w:p>
@@ -471,7 +466,7 @@
         <w:pStyle w:val="ListNumber"/>
       </w:pPr>
       <w:r>
-        <w:t>5. Beyond price movements, how can blockchain companies leverage periods of market pessimism to build infrastructure, foster innovation, and attract long-term talent?</w:t>
+        <w:t>5. How does the DTCC's initiative to integrate tokenized assets on Stellar impact the broader adoption timeline and perceived legitimacy of enterprise blockchain solutions in Wall Street?</w:t>
       </w:r>
     </w:p>
     <w:p>
@@ -484,17 +479,27 @@
     </w:p>
     <w:p>
       <w:r>
-        <w:t>[1] Bitcoin, ether, XRP rebound as Senate curbs Trump's Iran war powers - May 20, 2026</w:t>
+        <w:t>[1] Crypto Long &amp; Short: How the GENIUS Act repriced bitcoin's monetary premium - May 27, 2026</w:t>
       </w:r>
     </w:p>
     <w:p>
       <w:r>
-        <w:t>[2] This bitcoin bear market is different with 'uniquely pessimistic' traders limiting downside, K33 says - May 19, 2026</w:t>
+        <w:t>[2] Crypto IPOs could create massive $1 trillion market amid tokenization wave, Jefferies says - May 27, 2026</w:t>
       </w:r>
     </w:p>
     <w:p>
       <w:r>
-        <w:t>[3] Hyperliquid’s HYPE one of crypto’s most undervalued assets, says Bitwise - May 19, 2026</w:t>
+        <w:t>[3] A bipartisan bridge to the future: Why the Senate must finish the job on digital Assets - May 27, 2026</w:t>
+      </w:r>
+    </w:p>
+    <w:p>
+      <w:r>
+        <w:t>[4] DTCC plans to bring tokenized assets to Stellar in latest Wall Street blockchain push - May 27, 2026</w:t>
+      </w:r>
+    </w:p>
+    <w:p>
+      <w:r>
+        <w:t>[5] Crypto’s biggest exchanges back push for token disclosure standards as industry courts institutional capital - May 27, 2026</w:t>
       </w:r>
     </w:p>
     <w:p/>

</xml_diff>

<commit_message>
Add cloud storage integration for Vercel deployment
</commit_message>
<xml_diff>
--- a/Daily_Tech_Briefing.docx
+++ b/Daily_Tech_Briefing.docx
@@ -16,7 +16,7 @@
         <w:rPr>
           <w:i/>
         </w:rPr>
-        <w:t>June 02, 2026</w:t>
+        <w:t>June 04, 2026</w:t>
       </w:r>
     </w:p>
     <w:p/>
@@ -33,7 +33,7 @@
         <w:pStyle w:val="Heading2"/>
       </w:pPr>
       <w:r>
-        <w:t>June 02, 2026</w:t>
+        <w:t>June 04, 2026</w:t>
       </w:r>
     </w:p>
     <w:p>
@@ -46,7 +46,7 @@
     </w:p>
     <w:p>
       <w:r>
-        <w:t>AI Innovation Accelerates, Security Challenges Persist</w:t>
+        <w:t>AI's Real-World Reckoning: Performance, Cost, and Governance</w:t>
       </w:r>
     </w:p>
     <w:p>
@@ -54,7 +54,7 @@
         <w:pStyle w:val="Heading2"/>
       </w:pPr>
       <w:r>
-        <w:t>AI Industry Briefing: June 02, 2026</w:t>
+        <w:t>AI Industry Briefing: June 04, 2026</w:t>
       </w:r>
     </w:p>
     <w:p>
@@ -67,17 +67,17 @@
     </w:p>
     <w:p>
       <w:r>
-        <w:t>- **Model Efficiency Breakthrough:** MiniMax-M3 has launched, outperforming leading models like GPT-5.5 and Gemini 3.1 Pro on key benchmarks while operating at a mere 5-10% of their cost [3].</w:t>
+        <w:t>- **AI Reality Check:** The effectiveness of AI solutions is being evaluated against initial promises as deployments increase, highlighting areas where practical fulfillment may fall short [1].</w:t>
       </w:r>
     </w:p>
     <w:p>
       <w:r>
-        <w:t>- **Agent Security Vulnerabilities:** An Anthropic browser agent was reportedly hijacked in 31.5% of instances before its integrated safeguards were activated, highlighting critical security considerations for AI agents [4].</w:t>
+        <w:t>- **Practical AI Finance:** Enterprises are encountering financial and operational challenges when integrating AI into existing workflows, requiring a balance between innovation and fiscal responsibility [2].</w:t>
       </w:r>
     </w:p>
     <w:p>
       <w:r>
-        <w:t>- **AI Outperforms Traditional:** An AI weather startup is demonstrating superior forecasting accuracy compared to established government agencies, showcasing AI's potential to disrupt traditional industries [1].</w:t>
+        <w:t>- **Accessible Local AI:** New open-source models capable of local, multi-modal processing are becoming available for enterprise use, reducing hardware and cloud dependency [3].</w:t>
       </w:r>
     </w:p>
     <w:p>
@@ -87,32 +87,32 @@
     </w:p>
     <w:p>
       <w:r>
-        <w:t>Next-Generation AI Performance and Cost</w:t>
+        <w:t>Assessing AI's Evolving Value</w:t>
       </w:r>
     </w:p>
     <w:p>
       <w:r>
-        <w:t>The MiniMax-M3 model has been introduced, demonstrating superior performance in crucial benchmark tests when compared to existing models such as GPT-5.5 and Gemini 3.1 Pro [3]. A notable aspect of this new model is its economic efficiency, with operational costs reported to be merely 5-10% of its competitors [3]. This development signals a potential shift in the accessibility and scalability of advanced AI capabilities.</w:t>
+        <w:t>Recent observations suggest that as AI technology advances, a disparity can emerge between its perceived capabilities and its actual impact, sometimes revealing unfulfilled expectations. This indicates a growing need for a realistic evaluation of AI's practical applications versus its initial promises [1]. This dynamic necessitates a clearer understanding of how improved AI performance translates into tangible benefits for various sectors.</w:t>
       </w:r>
     </w:p>
     <w:p>
       <w:r>
-        <w:t>Vulnerabilities in AI Agent Deployment</w:t>
+        <w:t>Enterprise AI Integration Challenges</w:t>
       </w:r>
     </w:p>
     <w:p>
       <w:r>
-        <w:t>Recent findings indicate security challenges within AI agent technology, specifically regarding an Anthropic browser agent [4]. This agent was reportedly compromised in 31.5% of instances before its integrated safeguards successfully intervened [4]. This incident underscores the importance of robust security protocols and continuous monitoring during the development and deployment of autonomous AI agents. The broader issue of security vulnerabilities is often attributed to system complexity rather than AI itself [5].</w:t>
+        <w:t>Major retailers, such as Walmart, are experiencing the economic realities of deploying AI workflows within their operations. The integration of AI technologies demands careful consideration of both the technological potential and the fiscal implications for the balance sheet, underscoring the complexities involved in achieving a positive return on investment [2]. These challenges highlight that successful AI adoption extends beyond technical prowess to include robust financial planning and operational alignment.</w:t>
       </w:r>
     </w:p>
     <w:p>
       <w:r>
-        <w:t>AI's Disruption in Established Industries</w:t>
+        <w:t>Advancements in Local AI Models</w:t>
       </w:r>
     </w:p>
     <w:p>
       <w:r>
-        <w:t>Artificial intelligence is demonstrating its capacity to surpass conventional methods in various fields, as evidenced by an AI weather startup [1]. This company is reportedly achieving more accurate weather forecasts compared to traditional government agencies [1]. This development illustrates AI's potential to enhance accuracy and efficiency in sectors traditionally reliant on long-standing operational models.</w:t>
+        <w:t>Google has released Gemma 4 12B, a new open-source model designed for analyzing audio and video content. This model stands out for its capability to run entirely locally on standard enterprise laptops equipped with 16GB of RAM, indicating a significant step toward making sophisticated AI more accessible and less reliant on cloud infrastructure [3]. Such advancements could empower enterprises to process sensitive data on-premises, enhancing security and reducing latency.</w:t>
       </w:r>
     </w:p>
     <w:p>
@@ -125,7 +125,7 @@
         <w:pStyle w:val="ListNumber"/>
       </w:pPr>
       <w:r>
-        <w:t>1. How will the cost-efficiency and performance of models like MiniMax-M3 impact the competitive landscape for foundational AI model providers?</w:t>
+        <w:t>1. How can organizations accurately measure the return on investment for AI initiatives, especially when facing significant implementation costs and integration complexities [2]?</w:t>
       </w:r>
     </w:p>
     <w:p>
@@ -133,7 +133,7 @@
         <w:pStyle w:val="ListNumber"/>
       </w:pPr>
       <w:r>
-        <w:t>2. What enhanced security frameworks and testing methodologies are necessary to mitigate the reported vulnerabilities in AI browser agents before widespread adoption?</w:t>
+        <w:t>2. What strategies should executives employ to manage the gap between perceived AI capabilities and actual operational impact, ensuring realistic expectations and outcomes [1]?</w:t>
       </w:r>
     </w:p>
     <w:p>
@@ -141,7 +141,7 @@
         <w:pStyle w:val="ListNumber"/>
       </w:pPr>
       <w:r>
-        <w:t>3. Given AI's ability to outperform traditional methods in areas like weather forecasting, which other established industries are ripe for similar AI-driven disruption?</w:t>
+        <w:t>3. How will the proliferation of locally runnable, multi-modal AI models, such as Google's Gemma 4 12B, influence enterprise data security, privacy policies, and infrastructure decisions [3]?</w:t>
       </w:r>
     </w:p>
     <w:p>
@@ -149,7 +149,7 @@
         <w:pStyle w:val="ListNumber"/>
       </w:pPr>
       <w:r>
-        <w:t>4. What ethical implications arise from deploying AI agents with reported compromise rates, even if safeguards eventually engage?</w:t>
+        <w:t>4. What ethical and regulatory frameworks are necessary to guide the development and deployment of emerging embodied AI technologies, considering global initiatives like Hong Kong's review [5]?</w:t>
       </w:r>
     </w:p>
     <w:p>
@@ -157,7 +157,7 @@
         <w:pStyle w:val="ListNumber"/>
       </w:pPr>
       <w:r>
-        <w:t>5. How can organizations balance the pursuit of advanced AI capabilities with the imperative to manage and reduce system complexity to prevent security breaches?</w:t>
+        <w:t>5. How can enterprises anticipate and leverage grassroots, innovative applications of AI by consumers, such as those used for World Cup ticket purchasing, to inform future product development or identify new market opportunities [4]?</w:t>
       </w:r>
     </w:p>
     <w:p>
@@ -170,27 +170,27 @@
     </w:p>
     <w:p>
       <w:r>
-        <w:t>[1] This AI weather startup is out-forecasting government agencies - Jun 01, 2026</w:t>
+        <w:t>[1] As AI gets better, it reveals an empty promise - Jun 03, 2026</w:t>
       </w:r>
     </w:p>
     <w:p>
       <w:r>
-        <w:t>[2] AI in video game development: How artificial intelligence is reshaping the industry - Jun 01, 2026</w:t>
+        <w:t>[2] Walmart’s AI workflows meet the realities of the balance sheet - Jun 03, 2026</w:t>
       </w:r>
     </w:p>
     <w:p>
       <w:r>
-        <w:t>[3] MiniMax-M3 debuts, eclipsing GPT-5.5 and Gemini 3.1 Pro on key benchmark performance for just 5-10% of the cost - Jun 01, 2026</w:t>
+        <w:t>[3] Google's new open source Gemma 4 12B analyzes audio, video — and runs entirely locally on a typical 16GB enterprise laptop - Jun 03, 2026</w:t>
       </w:r>
     </w:p>
     <w:p>
       <w:r>
-        <w:t>[4] Anthropic’s browser agent got hijacked 31.5% of the time before safeguards engaged - Jun 01, 2026</w:t>
+        <w:t>[4] Redditors Are Using AI to Beat Obscene World Cup Ticket Prices - Jun 03, 2026</w:t>
       </w:r>
     </w:p>
     <w:p>
       <w:r>
-        <w:t>[5] AI doesn't break security. Complexity does - Jun 01, 2026</w:t>
+        <w:t>[5] Hong Kong Reviews Regulation and Strategy for Emerging Embodied AI Technologies - Jun 03, 2026</w:t>
       </w:r>
     </w:p>
     <w:p>
@@ -203,7 +203,7 @@
     </w:p>
     <w:p>
       <w:r>
-        <w:t>Urgent Threats and Evolving Security Strategies</w:t>
+        <w:t>Emerging Vulnerabilities and Attacker Tactics</w:t>
       </w:r>
     </w:p>
     <w:p>
@@ -211,7 +211,7 @@
         <w:pStyle w:val="Heading2"/>
       </w:pPr>
       <w:r>
-        <w:t>Cyber Security Briefing: June 02, 2026</w:t>
+        <w:t>Cyber Security Briefing: June 04, 2026</w:t>
       </w:r>
     </w:p>
     <w:p>
@@ -224,17 +224,17 @@
     </w:p>
     <w:p>
       <w:r>
-        <w:t>- **MSP Strategy:** Managed Security Service Providers (MSPs) are increasingly adopting security growth platforms that extend beyond traditional vCISO tool offerings to deliver more comprehensive services [1].</w:t>
+        <w:t>- **Developer Credential Theft:** A one-click exploit targeting GitHub developers enables the theft of full GitHub OAuth tokens, posing a significant risk to organizational codebases and development pipelines [1].</w:t>
       </w:r>
     </w:p>
     <w:p>
       <w:r>
-        <w:t>- **Web Application Exploits:** A critical vulnerability in the WP Maps Pro plugin is currently being actively exploited, enabling unauthorized creation of administrative accounts [2].</w:t>
+        <w:t>- **Critical Infrastructure Flaws:** New vulnerabilities include an unpatched Windows Search URI flaw allowing NTLMv2 hash theft and an HTTP/2 Bomb vulnerability capable of remote Denial of Service against major web servers [3] [4].</w:t>
       </w:r>
     </w:p>
     <w:p>
       <w:r>
-        <w:t>- **Critical Infrastructure Exploits:** Both a remote code execution flaw in Windows Netlogon and an authentication bypass bug in Palo Alto products are actively being leveraged by attackers, necessitating immediate security updates [3, 4].</w:t>
+        <w:t>- **Proactive Threat Insight:** Adopting an attacker's perspective is vital for identifying and addressing network weaknesses before they can be exploited, emphasizing a proactive security posture [2].</w:t>
       </w:r>
     </w:p>
     <w:p>
@@ -244,32 +244,32 @@
     </w:p>
     <w:p>
       <w:r>
-        <w:t>Evolving Security Service Delivery</w:t>
+        <w:t>GitHub Developer Compromise</w:t>
       </w:r>
     </w:p>
     <w:p>
       <w:r>
-        <w:t>Managed Service Providers (MSPs) are shifting their focus from solely offering virtual CISO (vCISO) tools to implementing more expansive security growth platforms. This strategic move aims to provide clients with a broader and more integrated suite of cybersecurity services and solutions [1]. The change reflects an industry trend towards comprehensive security frameworks that support continuous growth and adaptation against emerging threats [1].</w:t>
+        <w:t>A recently identified vulnerability allows attackers to steal full GitHub OAuth tokens through a single user interaction. This method targets developers, potentially granting unauthorized access to private repositories and sensitive code within an organization's development environment [1]. The exploit's one-click nature lowers the barrier for adversaries to compromise developer accounts and gain broader network access.</w:t>
       </w:r>
     </w:p>
     <w:p>
       <w:r>
-        <w:t>Active Exploitation of Web Application Vulnerabilities</w:t>
+        <w:t>Critical System Vulnerabilities</w:t>
       </w:r>
     </w:p>
     <w:p>
       <w:r>
-        <w:t>A significant security flaw within the WP Maps Pro plugin is currently under active exploitation. This critical vulnerability allows malicious actors to create new administrative accounts without proper authorization, potentially leading to full compromise of affected systems [2]. Organizations utilizing this plugin are advised to apply patches immediately to mitigate the risk of unauthorized access and data breaches [2].</w:t>
+        <w:t>Multiple critical vulnerabilities have surfaced, presenting distinct threats to enterprise systems. An unpatched flaw within the Windows Search URI scheme permits attackers to steal NTLMv2 hashes, which could be used for further authentication attacks [3]. Separately, a new HTTP/2 Bomb vulnerability has been disclosed, capable of causing remote Denial of Service (DoS) conditions on widely used web servers, including NGINX, Apache, IIS, Envoy, and Cloudflare [4]. Such DoS attacks can disrupt essential services and significantly impact operational continuity.</w:t>
       </w:r>
     </w:p>
     <w:p>
       <w:r>
-        <w:t>Infrastructure and Network Security Gaps Under Attack</w:t>
+        <w:t>Attacker Mindset and Network Defense</w:t>
       </w:r>
     </w:p>
     <w:p>
       <w:r>
-        <w:t>Recent reports confirm active exploitation of a critical remote code execution (RCE) vulnerability in Windows Netlogon, posing a severe risk to enterprise networks [3]. Separately, another critical authentication bypass vulnerability impacting Palo Alto products is also being actively exploited [4]. These ongoing attack campaigns highlight persistent weaknesses in foundational IT infrastructure and network security perimeters. Organizations must prioritize applying the necessary patches and updates for both Windows Netlogon and Palo Alto products to prevent potential network compromise and unauthorized access [3, 4].</w:t>
+        <w:t>Understanding how malicious actors perceive and target network infrastructure is a crucial component of effective cybersecurity. Security professionals are encouraged to analyze their networks from an attacker's viewpoint, which can help in proactively discovering and rectifying vulnerabilities before they are exploited. This approach moves beyond merely reacting to known threats, fostering a more resilient security posture [2].</w:t>
       </w:r>
     </w:p>
     <w:p>
@@ -282,7 +282,7 @@
         <w:pStyle w:val="ListNumber"/>
       </w:pPr>
       <w:r>
-        <w:t>1. How will the industry's shift towards security growth platforms by MSPs impact in-house cybersecurity team resource allocation and strategy?</w:t>
+        <w:t>1. What immediate steps are necessary to protect our developer environments from one-click credential theft vulnerabilities?</w:t>
       </w:r>
     </w:p>
     <w:p>
@@ -290,7 +290,7 @@
         <w:pStyle w:val="ListNumber"/>
       </w:pPr>
       <w:r>
-        <w:t>2. What immediate actions are being taken to identify and mitigate critical vulnerabilities in web applications like the WP Maps Pro flaw across our digital assets?</w:t>
+        <w:t>2. How are we assessing our exposure to the unpatched Windows Search URI flaw and the new HTTP/2 Bomb vulnerability?</w:t>
       </w:r>
     </w:p>
     <w:p>
@@ -298,7 +298,7 @@
         <w:pStyle w:val="ListNumber"/>
       </w:pPr>
       <w:r>
-        <w:t>3. Beyond patching, what long-term strategies are in place to address the root causes of frequently exploited critical infrastructure flaws, such as those found in Windows Netlogon and Palo Alto products?</w:t>
+        <w:t>3. What strategies are in place to continuously evaluate our network defenses from an external attacker's perspective?</w:t>
       </w:r>
     </w:p>
     <w:p>
@@ -306,7 +306,7 @@
         <w:pStyle w:val="ListNumber"/>
       </w:pPr>
       <w:r>
-        <w:t>4. How are we currently assessing and managing the supply chain risk associated with third-party plugins and components used in our web applications?</w:t>
+        <w:t>4. How do we ensure that our incident response plans adequately address the potential for both developer account compromise and widespread Denial of Service events?</w:t>
       </w:r>
     </w:p>
     <w:p>
@@ -314,7 +314,7 @@
         <w:pStyle w:val="ListNumber"/>
       </w:pPr>
       <w:r>
-        <w:t>5. What proactive measures are we implementing to ensure rapid detection and response to newly identified critical vulnerabilities under active exploitation?</w:t>
+        <w:t>5. What investments are required to enhance our proactive threat hunting capabilities and reduce our overall attack surface?</w:t>
       </w:r>
     </w:p>
     <w:p>
@@ -327,22 +327,22 @@
     </w:p>
     <w:p>
       <w:r>
-        <w:t>[1] The Security Growth Platform: Why MSPs Are Moving Beyond vCISO Tools - Jun 01, 2026</w:t>
+        <w:t>[1] One-Click GitHub Dev Attack Lets Attackers Steal Full GitHub OAuth Tokens - Jun 03, 2026</w:t>
       </w:r>
     </w:p>
     <w:p>
       <w:r>
-        <w:t>[2] Critical WP Maps Pro Flaw Actively Exploited to Create Admin Accounts - Jun 01, 2026</w:t>
+        <w:t>[2] Beyond the Zero-Day: See Your Network Like an Attacker | Webinar with HD Moore - Jun 03, 2026</w:t>
       </w:r>
     </w:p>
     <w:p>
       <w:r>
-        <w:t>[3] Critical Windows Netlogon RCE flaw now exploited in attacks - Jun 01, 2026</w:t>
+        <w:t>[3] Unpatched Windows Search URI Vulnerability Lets Attackers Steal NTLMv2 Hashes - Jun 03, 2026</w:t>
       </w:r>
     </w:p>
     <w:p>
       <w:r>
-        <w:t>[4] Patch Now: Another Palo Alto Auth Bypass Bug Under Active Exploit - Jun 01, 2026</w:t>
+        <w:t>[4] New HTTP/2 Bomb Vulnerability Allows Remote DoS on NGINX, Apache, IIS, Envoy &amp; Cloudflare - Jun 03, 2026</w:t>
       </w:r>
     </w:p>
     <w:p>
@@ -355,7 +355,7 @@
     </w:p>
     <w:p>
       <w:r>
-        <w:t>Navigating Market Shifts and Regulatory Horizons</w:t>
+        <w:t>Navigating Digital Assets: Executive Briefing</w:t>
       </w:r>
     </w:p>
     <w:p>
@@ -363,7 +363,7 @@
         <w:pStyle w:val="Heading2"/>
       </w:pPr>
       <w:r>
-        <w:t>Crypto, Fintech, and Web3 Briefing: June 02, 2026</w:t>
+        <w:t>Crypto, Fintech, and Web3 Briefing: June 04, 2026</w:t>
       </w:r>
     </w:p>
     <w:p>
@@ -376,17 +376,17 @@
     </w:p>
     <w:p>
       <w:r>
-        <w:t>- **Market Trends:** Crypto funds experienced significant outflows, marking the second-largest of the year, while specific digital assets like XRP and HYPE attracted investment, and Bitcoin remained under pressure [1] [5].</w:t>
+        <w:t>- **DeFi Funding:** A new decentralized finance entity is now providing additional avenues for crypto-based political campaign contributions as elections draw near [1].</w:t>
       </w:r>
     </w:p>
     <w:p>
       <w:r>
-        <w:t>- **DeFi Evolution:** Ethereum co-founder Vitalik Buterin is actively reconsidering current decentralized finance mechanisms to enhance their resilience during market downturns [2].</w:t>
+        <w:t>- **Bank Digital Holdings:** A financial executive predicts that all banking institutions will soon be compelled to maintain digital assets [2].</w:t>
       </w:r>
     </w:p>
     <w:p>
       <w:r>
-        <w:t>- **Japanese Policy:** Japan’s ruling party supports the trading of crypto exchange-traded funds and the development of yen-denominated stablecoins [3].</w:t>
+        <w:t>- **Bitcoin Outlook:** Bitcoin has reportedly reached a historical low point on the Power Law model, a level that has previously indicated a market rebound [3].</w:t>
       </w:r>
     </w:p>
     <w:p>
@@ -396,32 +396,32 @@
     </w:p>
     <w:p>
       <w:r>
-        <w:t>Cryptocurrency Market Trends</w:t>
+        <w:t>Political Crypto Funding</w:t>
       </w:r>
     </w:p>
     <w:p>
       <w:r>
-        <w:t>Investment products focused on cryptocurrencies recorded their second-largest weekly outflows of 2026, totaling $58 million. Bitcoin-centric funds were particularly affected, accounting for a substantial portion of these withdrawals. In contrast, certain alternative digital assets, specifically XRP and a token referred to as HYPE, observed modest inflows during the same period. The broader Bitcoin market continued to face downward pressure, influenced by factors including sustained ETF outflows and increasing oil prices [1] [5].</w:t>
+        <w:t>A recent entry into the decentralized finance sector is expanding the available mechanisms for funding political campaigns through cryptocurrency, particularly as elections approach [1]. This development introduces new considerations for how digital assets intersect with political finance, potentially influencing transparency and regulatory frameworks in the coming election cycle [1].</w:t>
       </w:r>
     </w:p>
     <w:p>
       <w:r>
-        <w:t>Rethinking DeFi Stability</w:t>
+        <w:t>Future of Bank Assets</w:t>
       </w:r>
     </w:p>
     <w:p>
       <w:r>
-        <w:t>Vitalik Buterin, a co-creator of Ethereum, is reportedly exploring new approaches to how decentralized finance (DeFi) systems manage market instability. This initiative focuses on developing mechanisms that could better protect DeFi protocols and users during periods of significant price crashes or volatility, aiming to build more robust and reliable decentralized financial infrastructure [2].</w:t>
+        <w:t>Julian Sawyer, the CEO of Zodia, has expressed the view that every financial institution will eventually be required to hold digital assets [2]. This perspective suggests a future where digital assets are integrated into traditional banking operations as a standard practice, indicating a fundamental shift in banking asset management strategies [2].</w:t>
       </w:r>
     </w:p>
     <w:p>
       <w:r>
-        <w:t>Regulatory Developments in Japan</w:t>
+        <w:t>Market Performance Insights</w:t>
       </w:r>
     </w:p>
     <w:p>
       <w:r>
-        <w:t>Japan's governing Liberal Democratic Party (LDP) has announced its backing for allowing domestic investment trusts to engage in the trading of crypto exchange-traded funds (ETFs). Furthermore, the LDP is advocating for policies that would encourage the issuance and widespread adoption of yen-based stablecoins. This signals a supportive regulatory environment for integrating digital assets further into Japan's financial system [3].</w:t>
+        <w:t>Bitcoin has reportedly reached a specific low point on the Power Law model, a level that has historically preceded a market rebound [3]. However, other analyses indicate that Bitcoin's price has fallen to its lowest level since March, occurring concurrently with an increase in oil prices [5]. Separately, analysis suggests Ethereum could experience a further 25% decrease in value before establishing a price bottom [4]. These different analytical perspectives highlight varying short-term outlooks and potential price trajectories for major digital assets [3, 4, 5].</w:t>
       </w:r>
     </w:p>
     <w:p>
@@ -434,7 +434,7 @@
         <w:pStyle w:val="ListNumber"/>
       </w:pPr>
       <w:r>
-        <w:t>1. How might the recent trend of crypto fund outflows influence the long-term investment strategies of institutional players in the digital asset space?</w:t>
+        <w:t>1. How will the expanded use of DeFi for political funding impact regulatory oversight and transparency requirements for digital assets in electoral processes?</w:t>
       </w:r>
     </w:p>
     <w:p>
@@ -442,7 +442,7 @@
         <w:pStyle w:val="ListNumber"/>
       </w:pPr>
       <w:r>
-        <w:t>2. What concrete innovations or protocol changes could emerge from Vitalik Buterin's reevaluation of DeFi stability, and how might these impact existing decentralized applications?</w:t>
+        <w:t>2. What strategic preparations should traditional financial institutions undertake to meet the anticipated requirement of holding digital assets?</w:t>
       </w:r>
     </w:p>
     <w:p>
@@ -450,7 +450,7 @@
         <w:pStyle w:val="ListNumber"/>
       </w:pPr>
       <w:r>
-        <w:t>3. What strategic opportunities or challenges could arise for global blockchain companies if Japan's supportive stance on crypto ETFs and yen-based stablecoins sets a precedent for other major economies?</w:t>
+        <w:t>3. Given the varying analyses of Bitcoin's current market position, what fundamental metrics are most critical for executives to monitor for informed investment decisions?</w:t>
       </w:r>
     </w:p>
     <w:p>
@@ -458,7 +458,7 @@
         <w:pStyle w:val="ListNumber"/>
       </w:pPr>
       <w:r>
-        <w:t>4. How should blockchain executives assess the implications of corporate actions, such as the sale of Bitcoin for dividend payments, on the broader narrative of Bitcoin as a long-term treasury asset?</w:t>
+        <w:t>4. What are the broader macroeconomic implications of oil price movements on cryptocurrency valuations, as suggested by recent market data?</w:t>
       </w:r>
     </w:p>
     <w:p>
@@ -466,7 +466,7 @@
         <w:pStyle w:val="ListNumber"/>
       </w:pPr>
       <w:r>
-        <w:t>5. Considering the influence of macroeconomic factors like oil prices on crypto markets, how can blockchain businesses better integrate traditional financial indicators into their market analysis and risk management frameworks?</w:t>
+        <w:t>5. How might a significant further price correction in Ethereum influence the development roadmap and adoption rates within the DeFi ecosystem?</w:t>
       </w:r>
     </w:p>
     <w:p>
@@ -479,27 +479,27 @@
     </w:p>
     <w:p>
       <w:r>
-        <w:t>[1] Crypto funds suffer second-largest outflows of 2026 while XRP and HYPE attract inflows - Jun 01, 2026</w:t>
+        <w:t>[1] New DeFi entrant widens field of crypto political campaign funds as elections loom - Jun 03, 2026</w:t>
       </w:r>
     </w:p>
     <w:p>
       <w:r>
-        <w:t>[2] Ethereum's Vitalik Buterin is rethinking how DeFi handles market crashes - Jun 01, 2026</w:t>
+        <w:t>[2] Every single bank will soon need to hold digital assets, says Zodia CEO Julian Sawyer - Jun 03, 2026</w:t>
       </w:r>
     </w:p>
     <w:p>
       <w:r>
-        <w:t>[3] Japan's ruling party supports crypto ETF trading, yen-based stablecoins - Jun 01, 2026</w:t>
+        <w:t>[3] Bitcoin hits Power Law level low that historically precedes a rebound - Jun 03, 2026</w:t>
       </w:r>
     </w:p>
     <w:p>
       <w:r>
-        <w:t>[4] Michael Saylor's Strategy sold 32 bitcoin for $2.5 million to fund dividend payments - Jun 01, 2026</w:t>
+        <w:t>[4] Why Ethereum Could Tank Another 25% Before Finding a Bottom: Analysis - Jun 03, 2026</w:t>
       </w:r>
     </w:p>
     <w:p>
       <w:r>
-        <w:t>[5] Bitcoin remains under pressure as ETF outflows, higher oil prices weigh on crypto markets - Jun 01, 2026</w:t>
+        <w:t>[5] As Oil Moves Higher, Bitcoin Sinks to Lowest Price Since March - Jun 03, 2026</w:t>
       </w:r>
     </w:p>
     <w:p/>

</xml_diff>